<commit_message>
Aula 26/09 (sáb. à tarde)
</commit_message>
<xml_diff>
--- a/DOC/Exemplos_Pandas.docx
+++ b/DOC/Exemplos_Pandas.docx
@@ -1342,7 +1342,13 @@
         <w:spacing w:after="0"/>
       </w:pPr>
       <w:r>
-        <w:t>print(idades_medias)</w:t>
+        <w:t>print(</w:t>
+      </w:r>
+      <w:r>
+        <w:t>paises_idades</w:t>
+      </w:r>
+      <w:r>
+        <w:t>)</w:t>
       </w:r>
     </w:p>
     <w:p>
@@ -1358,7 +1364,13 @@
         <w:spacing w:after="0"/>
       </w:pPr>
       <w:r>
-        <w:t>print(len(idades_medias), 'registros')</w:t>
+        <w:t>print(len(</w:t>
+      </w:r>
+      <w:r>
+        <w:t>paises_idades</w:t>
+      </w:r>
+      <w:r>
+        <w:t>), 'registros')</w:t>
       </w:r>
     </w:p>
     <w:p>
@@ -1715,7 +1727,16 @@
         <w:spacing w:after="0"/>
       </w:pPr>
       <w:r>
-        <w:t>idades[idades &lt; 18]</w:t>
+        <w:t>idades[</w:t>
+      </w:r>
+      <w:r>
+        <w:t>novasIdades</w:t>
+      </w:r>
+      <w:r>
+        <w:t xml:space="preserve"> </w:t>
+      </w:r>
+      <w:r>
+        <w:t>&lt; 18]</w:t>
       </w:r>
     </w:p>
     <w:p>
@@ -4000,7 +4021,13 @@
         <w:rPr>
           <w:rFonts w:ascii="Courier New" w:hAnsi="Courier New" w:cs="Courier New"/>
         </w:rPr>
-        <w:t># Pessoas de 20 a 30 anos e nunca casados</w:t>
+        <w:t xml:space="preserve"># Pessoas de 20 a 30 anos e </w:t>
+      </w:r>
+      <w:r>
+        <w:rPr>
+          <w:rFonts w:ascii="Courier New" w:hAnsi="Courier New" w:cs="Courier New"/>
+        </w:rPr>
+        <w:t>divorciados</w:t>
       </w:r>
     </w:p>
     <w:p>
@@ -4138,11 +4165,13 @@
         <w:spacing w:after="0"/>
         <w:rPr>
           <w:rFonts w:ascii="Courier New" w:hAnsi="Courier New" w:cs="Courier New"/>
-        </w:rPr>
-      </w:pPr>
-      <w:r>
-        <w:rPr>
-          <w:rFonts w:ascii="Courier New" w:hAnsi="Courier New" w:cs="Courier New"/>
+          <w:color w:val="EE0000"/>
+        </w:rPr>
+      </w:pPr>
+      <w:r>
+        <w:rPr>
+          <w:rFonts w:ascii="Courier New" w:hAnsi="Courier New" w:cs="Courier New"/>
+          <w:color w:val="EE0000"/>
         </w:rPr>
         <w:t># Pessoas com 18 anos e casadas</w:t>
       </w:r>
@@ -4152,11 +4181,13 @@
         <w:spacing w:after="0"/>
         <w:rPr>
           <w:rFonts w:ascii="Courier New" w:hAnsi="Courier New" w:cs="Courier New"/>
-        </w:rPr>
-      </w:pPr>
-      <w:r>
-        <w:rPr>
-          <w:rFonts w:ascii="Courier New" w:hAnsi="Courier New" w:cs="Courier New"/>
+          <w:color w:val="EE0000"/>
+        </w:rPr>
+      </w:pPr>
+      <w:r>
+        <w:rPr>
+          <w:rFonts w:ascii="Courier New" w:hAnsi="Courier New" w:cs="Courier New"/>
+          <w:color w:val="EE0000"/>
         </w:rPr>
         <w:t>df.</w:t>
       </w:r>
@@ -4165,42 +4196,28 @@
           <w:rFonts w:ascii="Courier New" w:hAnsi="Courier New" w:cs="Courier New"/>
           <w:b/>
           <w:bCs/>
+          <w:color w:val="EE0000"/>
         </w:rPr>
         <w:t>query</w:t>
       </w:r>
       <w:r>
         <w:rPr>
           <w:rFonts w:ascii="Courier New" w:hAnsi="Courier New" w:cs="Courier New"/>
-        </w:rPr>
-        <w:t>(</w:t>
-      </w:r>
-      <w:r>
-        <w:rPr>
-          <w:rFonts w:ascii="Courier New" w:hAnsi="Courier New" w:cs="Courier New"/>
-        </w:rPr>
-        <w:t>"</w:t>
-      </w:r>
-      <w:r>
-        <w:rPr>
-          <w:rFonts w:ascii="Courier New" w:hAnsi="Courier New" w:cs="Courier New"/>
-        </w:rPr>
-        <w:t>'</w:t>
-      </w:r>
-      <w:r>
-        <w:rPr>
-          <w:rFonts w:ascii="Courier New" w:hAnsi="Courier New" w:cs="Courier New"/>
-        </w:rPr>
-        <w:t>age</w:t>
-      </w:r>
-      <w:r>
-        <w:rPr>
-          <w:rFonts w:ascii="Courier New" w:hAnsi="Courier New" w:cs="Courier New"/>
-        </w:rPr>
-        <w:t>' == 18 and '</w:t>
-      </w:r>
-      <w:r>
-        <w:rPr>
-          <w:rFonts w:ascii="Courier New" w:hAnsi="Courier New" w:cs="Courier New"/>
+          <w:color w:val="EE0000"/>
+        </w:rPr>
+        <w:t xml:space="preserve">("age == 18 and </w:t>
+      </w:r>
+      <w:r>
+        <w:rPr>
+          <w:rFonts w:ascii="Courier New" w:hAnsi="Courier New" w:cs="Courier New"/>
+          <w:color w:val="EE0000"/>
+        </w:rPr>
+        <w:t>`</w:t>
+      </w:r>
+      <w:r>
+        <w:rPr>
+          <w:rFonts w:ascii="Courier New" w:hAnsi="Courier New" w:cs="Courier New"/>
+          <w:color w:val="EE0000"/>
         </w:rPr>
         <w:t>marital-status</w:t>
       </w:r>
@@ -4209,12 +4226,23 @@
           <w:rFonts w:ascii="Courier New" w:hAnsi="Courier New" w:cs="Courier New"/>
           <w:b/>
           <w:bCs/>
-        </w:rPr>
-        <w:t xml:space="preserve">' </w:t>
-      </w:r>
-      <w:r>
-        <w:rPr>
-          <w:rFonts w:ascii="Courier New" w:hAnsi="Courier New" w:cs="Courier New"/>
+          <w:color w:val="EE0000"/>
+        </w:rPr>
+        <w:t>`</w:t>
+      </w:r>
+      <w:r>
+        <w:rPr>
+          <w:rFonts w:ascii="Courier New" w:hAnsi="Courier New" w:cs="Courier New"/>
+          <w:b/>
+          <w:bCs/>
+          <w:color w:val="EE0000"/>
+        </w:rPr>
+        <w:t xml:space="preserve"> </w:t>
+      </w:r>
+      <w:r>
+        <w:rPr>
+          <w:rFonts w:ascii="Courier New" w:hAnsi="Courier New" w:cs="Courier New"/>
+          <w:color w:val="EE0000"/>
         </w:rPr>
         <w:t>== ' Married'")</w:t>
       </w:r>

</xml_diff>